<commit_message>
Allow work reuse after council decision
Updates position-request work reuse rules to match the 2569 regulation: works from undecided requests remain locked, while works from council-decided requests can be reused only when disclosed in doc 1 (used flag, year, and quality level). Adds earlier-use warnings/blocking on submit, shared UI guidance, and publication source metadata for pickers. Also changes phase-2 doc 6 signing flow so the applicant signs before the dean (with migration), enhances doc 6 Scopus picking behavior, updates doc 9 author-role guidance/logic, and aligns tests with the new workflow.
</commit_message>
<xml_diff>
--- a/HRCP-KKU-Academic/src/main/resources/templates/docx/Phase2/p2doc_9.docx
+++ b/HRCP-KKU-Academic/src/main/resources/templates/docx/Phase2/p2doc_9.docx
@@ -328,16 +328,6 @@
           <w:sz w:val="32"/>
           <w:szCs w:val="32"/>
           <w:cs/>
-        </w:rPr>
-        <w:tab/>
-      </w:r>
-      <w:r>
-        <w:rPr>
-          <w:rFonts w:ascii="TH Sarabun New" w:eastAsiaTheme="minorHAnsi" w:hAnsi="TH Sarabun New" w:cs="TH Sarabun New"/>
-          <w:sz w:val="32"/>
-          <w:szCs w:val="32"/>
-          <w:cs/>
-          <w:lang w:bidi="th-TH"/>
         </w:rPr>
         <w:tab/>
       </w:r>

</xml_diff>